<commit_message>
tarea-1, más link del repositorio
</commit_message>
<xml_diff>
--- a/BARRETO_P_HÉCTOR... ACTIVIDAD#1... ESTUDIO DE CASO... SISTEMEA DE CONTROL DE RESCATE Y ADOPCIÓN ANIMAL... 17 OCT 26.docx
+++ b/BARRETO_P_HÉCTOR... ACTIVIDAD#1... ESTUDIO DE CASO... SISTEMEA DE CONTROL DE RESCATE Y ADOPCIÓN ANIMAL... 17 OCT 26.docx
@@ -5036,6 +5036,179 @@
         <w:spacing w:after="0" w:line="240" w:lineRule="auto"/>
         <w:jc w:val="both"/>
         <w:rPr>
+          <w:rFonts w:ascii="Arial" w:hAnsi="Arial" w:cs="Arial"/>
+          <w:b/>
+          <w:bCs/>
+          <w:sz w:val="24"/>
+          <w:szCs w:val="24"/>
+          <w:lang w:eastAsia="es-EC"/>
+        </w:rPr>
+      </w:pPr>
+    </w:p>
+    <w:p>
+      <w:pPr>
+        <w:widowControl w:val="0"/>
+        <w:pBdr>
+          <w:top w:val="nil"/>
+          <w:left w:val="nil"/>
+          <w:bottom w:val="nil"/>
+          <w:right w:val="nil"/>
+          <w:between w:val="nil"/>
+        </w:pBdr>
+        <w:spacing w:after="0" w:line="240" w:lineRule="auto"/>
+        <w:jc w:val="both"/>
+        <w:rPr>
+          <w:rFonts w:ascii="Arial" w:hAnsi="Arial" w:cs="Arial"/>
+          <w:b/>
+          <w:bCs/>
+          <w:sz w:val="24"/>
+          <w:szCs w:val="24"/>
+          <w:lang w:eastAsia="es-EC"/>
+        </w:rPr>
+      </w:pPr>
+    </w:p>
+    <w:p>
+      <w:pPr>
+        <w:widowControl w:val="0"/>
+        <w:pBdr>
+          <w:top w:val="nil"/>
+          <w:left w:val="nil"/>
+          <w:bottom w:val="nil"/>
+          <w:right w:val="nil"/>
+          <w:between w:val="nil"/>
+        </w:pBdr>
+        <w:spacing w:after="0" w:line="240" w:lineRule="auto"/>
+        <w:jc w:val="both"/>
+        <w:rPr>
+          <w:rFonts w:ascii="Arial" w:hAnsi="Arial" w:cs="Arial"/>
+          <w:b/>
+          <w:bCs/>
+          <w:sz w:val="24"/>
+          <w:szCs w:val="24"/>
+          <w:lang w:eastAsia="es-EC"/>
+        </w:rPr>
+      </w:pPr>
+    </w:p>
+    <w:p>
+      <w:pPr>
+        <w:widowControl w:val="0"/>
+        <w:pBdr>
+          <w:top w:val="nil"/>
+          <w:left w:val="nil"/>
+          <w:bottom w:val="nil"/>
+          <w:right w:val="nil"/>
+          <w:between w:val="nil"/>
+        </w:pBdr>
+        <w:shd w:val="clear" w:color="auto" w:fill="FFFF00"/>
+        <w:spacing w:after="0" w:line="240" w:lineRule="auto"/>
+        <w:jc w:val="both"/>
+        <w:rPr>
+          <w:rFonts w:ascii="Arial" w:hAnsi="Arial" w:cs="Arial"/>
+          <w:b/>
+          <w:bCs/>
+          <w:sz w:val="24"/>
+          <w:szCs w:val="24"/>
+          <w:lang w:eastAsia="es-EC"/>
+        </w:rPr>
+      </w:pPr>
+      <w:r>
+        <w:rPr>
+          <w:rFonts w:ascii="Arial" w:hAnsi="Arial" w:cs="Arial"/>
+          <w:b/>
+          <w:bCs/>
+          <w:sz w:val="24"/>
+          <w:szCs w:val="24"/>
+          <w:lang w:eastAsia="es-EC"/>
+        </w:rPr>
+        <w:t xml:space="preserve">Link al repositorio </w:t>
+      </w:r>
+      <w:proofErr w:type="spellStart"/>
+      <w:r>
+        <w:rPr>
+          <w:rFonts w:ascii="Arial" w:hAnsi="Arial" w:cs="Arial"/>
+          <w:b/>
+          <w:bCs/>
+          <w:sz w:val="24"/>
+          <w:szCs w:val="24"/>
+          <w:lang w:eastAsia="es-EC"/>
+        </w:rPr>
+        <w:t>github</w:t>
+      </w:r>
+      <w:proofErr w:type="spellEnd"/>
+      <w:r>
+        <w:rPr>
+          <w:rFonts w:ascii="Arial" w:hAnsi="Arial" w:cs="Arial"/>
+          <w:b/>
+          <w:bCs/>
+          <w:sz w:val="24"/>
+          <w:szCs w:val="24"/>
+          <w:lang w:eastAsia="es-EC"/>
+        </w:rPr>
+        <w:t>…</w:t>
+      </w:r>
+    </w:p>
+    <w:p>
+      <w:pPr>
+        <w:widowControl w:val="0"/>
+        <w:pBdr>
+          <w:top w:val="nil"/>
+          <w:left w:val="nil"/>
+          <w:bottom w:val="nil"/>
+          <w:right w:val="nil"/>
+          <w:between w:val="nil"/>
+        </w:pBdr>
+        <w:shd w:val="clear" w:color="auto" w:fill="FFFF00"/>
+        <w:spacing w:after="0" w:line="240" w:lineRule="auto"/>
+        <w:jc w:val="both"/>
+        <w:rPr>
+          <w:rFonts w:ascii="Arial" w:hAnsi="Arial" w:cs="Arial"/>
+          <w:b/>
+          <w:bCs/>
+          <w:sz w:val="24"/>
+          <w:szCs w:val="24"/>
+          <w:lang w:eastAsia="es-EC"/>
+        </w:rPr>
+      </w:pPr>
+      <w:hyperlink r:id="rId27" w:history="1">
+        <w:r>
+          <w:rPr>
+            <w:rStyle w:val="Hipervnculo"/>
+            <w:rFonts w:ascii="Arial" w:hAnsi="Arial" w:cs="Arial"/>
+            <w:b/>
+            <w:bCs/>
+            <w:sz w:val="24"/>
+            <w:szCs w:val="24"/>
+            <w:lang w:eastAsia="es-EC"/>
+          </w:rPr>
+          <w:t>https://github.com/hbarreto9078-art/DESARR_SIST_INFORM_1</w:t>
+        </w:r>
+      </w:hyperlink>
+      <w:r>
+        <w:rPr>
+          <w:rFonts w:ascii="Arial" w:hAnsi="Arial" w:cs="Arial"/>
+          <w:b/>
+          <w:bCs/>
+          <w:sz w:val="24"/>
+          <w:szCs w:val="24"/>
+          <w:lang w:eastAsia="es-EC"/>
+        </w:rPr>
+        <w:t xml:space="preserve"> </w:t>
+      </w:r>
+    </w:p>
+    <w:p>
+      <w:pPr>
+        <w:widowControl w:val="0"/>
+        <w:pBdr>
+          <w:top w:val="nil"/>
+          <w:left w:val="nil"/>
+          <w:bottom w:val="nil"/>
+          <w:right w:val="nil"/>
+          <w:between w:val="nil"/>
+        </w:pBdr>
+        <w:shd w:val="clear" w:color="auto" w:fill="FFFF00"/>
+        <w:spacing w:after="0" w:line="240" w:lineRule="auto"/>
+        <w:jc w:val="both"/>
+        <w:rPr>
           <w:rFonts w:ascii="Arial" w:eastAsiaTheme="majorEastAsia" w:hAnsi="Arial" w:cs="Arial"/>
           <w:b/>
           <w:bCs/>
@@ -5261,7 +5434,7 @@
       <w:r>
         <w:t xml:space="preserve"> con diagramas UML. </w:t>
       </w:r>
-      <w:hyperlink r:id="rId27" w:tgtFrame="_blank" w:history="1">
+      <w:hyperlink r:id="rId28" w:tgtFrame="_blank" w:history="1">
         <w:r>
           <w:rPr>
             <w:rStyle w:val="Hipervnculo"/>
@@ -5400,7 +5573,7 @@
       <w:r>
         <w:t xml:space="preserve">). </w:t>
       </w:r>
-      <w:hyperlink r:id="rId28" w:tgtFrame="_blank" w:history="1">
+      <w:hyperlink r:id="rId29" w:tgtFrame="_blank" w:history="1">
         <w:r>
           <w:rPr>
             <w:rStyle w:val="Hipervnculo"/>
@@ -5550,7 +5723,7 @@
       <w:r>
         <w:t xml:space="preserve">). </w:t>
       </w:r>
-      <w:hyperlink r:id="rId29" w:tgtFrame="_blank" w:history="1">
+      <w:hyperlink r:id="rId30" w:tgtFrame="_blank" w:history="1">
         <w:r>
           <w:rPr>
             <w:rStyle w:val="Hipervnculo"/>
@@ -5565,7 +5738,7 @@
         </w:rPr>
         <w:br/>
       </w:r>
-      <w:hyperlink r:id="rId30" w:history="1">
+      <w:hyperlink r:id="rId31" w:history="1">
         <w:r>
           <w:rPr>
             <w:rStyle w:val="Hipervnculo"/>
@@ -5618,7 +5791,7 @@
           <w:lang w:eastAsia="es-EC"/>
         </w:rPr>
       </w:pPr>
-      <w:hyperlink r:id="rId31" w:history="1">
+      <w:hyperlink r:id="rId32" w:history="1">
         <w:r>
           <w:rPr>
             <w:rStyle w:val="Hipervnculo"/>
@@ -5680,8 +5853,268 @@
         </w:rPr>
       </w:pPr>
     </w:p>
+    <w:p>
+      <w:pPr>
+        <w:widowControl w:val="0"/>
+        <w:pBdr>
+          <w:top w:val="nil"/>
+          <w:left w:val="nil"/>
+          <w:bottom w:val="nil"/>
+          <w:right w:val="nil"/>
+          <w:between w:val="nil"/>
+        </w:pBdr>
+        <w:spacing w:after="0" w:line="240" w:lineRule="auto"/>
+        <w:jc w:val="both"/>
+        <w:rPr>
+          <w:rFonts w:ascii="Arial" w:hAnsi="Arial" w:cs="Arial"/>
+          <w:i/>
+          <w:iCs/>
+          <w:sz w:val="20"/>
+          <w:szCs w:val="20"/>
+          <w:lang w:eastAsia="es-EC"/>
+        </w:rPr>
+      </w:pPr>
+    </w:p>
+    <w:p>
+      <w:pPr>
+        <w:widowControl w:val="0"/>
+        <w:pBdr>
+          <w:top w:val="nil"/>
+          <w:left w:val="nil"/>
+          <w:bottom w:val="nil"/>
+          <w:right w:val="nil"/>
+          <w:between w:val="nil"/>
+        </w:pBdr>
+        <w:spacing w:after="0" w:line="240" w:lineRule="auto"/>
+        <w:jc w:val="both"/>
+        <w:rPr>
+          <w:rFonts w:ascii="Arial" w:hAnsi="Arial" w:cs="Arial"/>
+          <w:i/>
+          <w:iCs/>
+          <w:sz w:val="20"/>
+          <w:szCs w:val="20"/>
+          <w:lang w:eastAsia="es-EC"/>
+        </w:rPr>
+      </w:pPr>
+    </w:p>
+    <w:p>
+      <w:pPr>
+        <w:widowControl w:val="0"/>
+        <w:pBdr>
+          <w:top w:val="nil"/>
+          <w:left w:val="nil"/>
+          <w:bottom w:val="nil"/>
+          <w:right w:val="nil"/>
+          <w:between w:val="nil"/>
+        </w:pBdr>
+        <w:spacing w:after="0" w:line="240" w:lineRule="auto"/>
+        <w:jc w:val="both"/>
+        <w:rPr>
+          <w:rFonts w:ascii="Arial" w:hAnsi="Arial" w:cs="Arial"/>
+          <w:i/>
+          <w:iCs/>
+          <w:sz w:val="20"/>
+          <w:szCs w:val="20"/>
+          <w:lang w:eastAsia="es-EC"/>
+        </w:rPr>
+      </w:pPr>
+    </w:p>
+    <w:p>
+      <w:pPr>
+        <w:widowControl w:val="0"/>
+        <w:pBdr>
+          <w:top w:val="nil"/>
+          <w:left w:val="nil"/>
+          <w:bottom w:val="nil"/>
+          <w:right w:val="nil"/>
+          <w:between w:val="nil"/>
+        </w:pBdr>
+        <w:spacing w:after="0" w:line="240" w:lineRule="auto"/>
+        <w:jc w:val="both"/>
+        <w:rPr>
+          <w:rFonts w:ascii="Arial" w:hAnsi="Arial" w:cs="Arial"/>
+          <w:i/>
+          <w:iCs/>
+          <w:sz w:val="20"/>
+          <w:szCs w:val="20"/>
+          <w:lang w:eastAsia="es-EC"/>
+        </w:rPr>
+      </w:pPr>
+    </w:p>
+    <w:p>
+      <w:pPr>
+        <w:widowControl w:val="0"/>
+        <w:pBdr>
+          <w:top w:val="nil"/>
+          <w:left w:val="nil"/>
+          <w:bottom w:val="nil"/>
+          <w:right w:val="nil"/>
+          <w:between w:val="nil"/>
+        </w:pBdr>
+        <w:spacing w:after="0" w:line="240" w:lineRule="auto"/>
+        <w:jc w:val="both"/>
+        <w:rPr>
+          <w:rFonts w:ascii="Arial" w:hAnsi="Arial" w:cs="Arial"/>
+          <w:i/>
+          <w:iCs/>
+          <w:sz w:val="20"/>
+          <w:szCs w:val="20"/>
+          <w:lang w:eastAsia="es-EC"/>
+        </w:rPr>
+      </w:pPr>
+    </w:p>
+    <w:p>
+      <w:pPr>
+        <w:widowControl w:val="0"/>
+        <w:pBdr>
+          <w:top w:val="nil"/>
+          <w:left w:val="nil"/>
+          <w:bottom w:val="nil"/>
+          <w:right w:val="nil"/>
+          <w:between w:val="nil"/>
+        </w:pBdr>
+        <w:spacing w:after="0" w:line="240" w:lineRule="auto"/>
+        <w:jc w:val="both"/>
+        <w:rPr>
+          <w:rFonts w:ascii="Arial" w:hAnsi="Arial" w:cs="Arial"/>
+          <w:i/>
+          <w:iCs/>
+          <w:sz w:val="20"/>
+          <w:szCs w:val="20"/>
+          <w:lang w:eastAsia="es-EC"/>
+        </w:rPr>
+      </w:pPr>
+    </w:p>
+    <w:p>
+      <w:pPr>
+        <w:widowControl w:val="0"/>
+        <w:pBdr>
+          <w:top w:val="nil"/>
+          <w:left w:val="nil"/>
+          <w:bottom w:val="nil"/>
+          <w:right w:val="nil"/>
+          <w:between w:val="nil"/>
+        </w:pBdr>
+        <w:spacing w:after="0" w:line="240" w:lineRule="auto"/>
+        <w:jc w:val="both"/>
+        <w:rPr>
+          <w:rFonts w:ascii="Arial" w:hAnsi="Arial" w:cs="Arial"/>
+          <w:i/>
+          <w:iCs/>
+          <w:sz w:val="20"/>
+          <w:szCs w:val="20"/>
+          <w:lang w:eastAsia="es-EC"/>
+        </w:rPr>
+      </w:pPr>
+    </w:p>
+    <w:p>
+      <w:pPr>
+        <w:widowControl w:val="0"/>
+        <w:pBdr>
+          <w:top w:val="nil"/>
+          <w:left w:val="nil"/>
+          <w:bottom w:val="nil"/>
+          <w:right w:val="nil"/>
+          <w:between w:val="nil"/>
+        </w:pBdr>
+        <w:spacing w:after="0" w:line="240" w:lineRule="auto"/>
+        <w:jc w:val="both"/>
+        <w:rPr>
+          <w:rFonts w:ascii="Lucida Console" w:hAnsi="Lucida Console" w:cs="Lucida Console"/>
+          <w:sz w:val="18"/>
+          <w:szCs w:val="18"/>
+        </w:rPr>
+      </w:pPr>
+      <w:proofErr w:type="spellStart"/>
+      <w:r>
+        <w:rPr>
+          <w:rFonts w:ascii="Lucida Console" w:hAnsi="Lucida Console" w:cs="Lucida Console"/>
+          <w:sz w:val="18"/>
+          <w:szCs w:val="18"/>
+        </w:rPr>
+        <w:t>git</w:t>
+      </w:r>
+      <w:proofErr w:type="spellEnd"/>
+      <w:r>
+        <w:rPr>
+          <w:rFonts w:ascii="Lucida Console" w:hAnsi="Lucida Console" w:cs="Lucida Console"/>
+          <w:sz w:val="18"/>
+          <w:szCs w:val="18"/>
+        </w:rPr>
+        <w:t xml:space="preserve"> remote </w:t>
+      </w:r>
+      <w:proofErr w:type="spellStart"/>
+      <w:r>
+        <w:rPr>
+          <w:rFonts w:ascii="Lucida Console" w:hAnsi="Lucida Console" w:cs="Lucida Console"/>
+          <w:sz w:val="18"/>
+          <w:szCs w:val="18"/>
+        </w:rPr>
+        <w:t>add</w:t>
+      </w:r>
+      <w:proofErr w:type="spellEnd"/>
+      <w:r>
+        <w:rPr>
+          <w:rFonts w:ascii="Lucida Console" w:hAnsi="Lucida Console" w:cs="Lucida Console"/>
+          <w:sz w:val="18"/>
+          <w:szCs w:val="18"/>
+        </w:rPr>
+        <w:t xml:space="preserve"> </w:t>
+      </w:r>
+      <w:proofErr w:type="spellStart"/>
+      <w:r>
+        <w:rPr>
+          <w:rFonts w:ascii="Lucida Console" w:hAnsi="Lucida Console" w:cs="Lucida Console"/>
+          <w:sz w:val="18"/>
+          <w:szCs w:val="18"/>
+        </w:rPr>
+        <w:t>origin</w:t>
+      </w:r>
+      <w:proofErr w:type="spellEnd"/>
+      <w:r>
+        <w:rPr>
+          <w:rFonts w:ascii="Lucida Console" w:hAnsi="Lucida Console" w:cs="Lucida Console"/>
+          <w:sz w:val="18"/>
+          <w:szCs w:val="18"/>
+        </w:rPr>
+        <w:t xml:space="preserve"> </w:t>
+      </w:r>
+      <w:hyperlink r:id="rId33" w:history="1">
+        <w:r>
+          <w:rPr>
+            <w:rStyle w:val="Hipervnculo"/>
+            <w:rFonts w:ascii="Lucida Console" w:hAnsi="Lucida Console" w:cs="Lucida Console"/>
+            <w:sz w:val="18"/>
+            <w:szCs w:val="18"/>
+          </w:rPr>
+          <w:t>https://github.com/hbarreto9078-art/DESARRO_SIST_INFORM_1.git</w:t>
+        </w:r>
+      </w:hyperlink>
+    </w:p>
+    <w:p>
+      <w:pPr>
+        <w:widowControl w:val="0"/>
+        <w:pBdr>
+          <w:top w:val="nil"/>
+          <w:left w:val="nil"/>
+          <w:bottom w:val="nil"/>
+          <w:right w:val="nil"/>
+          <w:between w:val="nil"/>
+        </w:pBdr>
+        <w:spacing w:after="0" w:line="240" w:lineRule="auto"/>
+        <w:jc w:val="both"/>
+        <w:rPr>
+          <w:rFonts w:ascii="Arial" w:hAnsi="Arial" w:cs="Arial"/>
+          <w:i/>
+          <w:iCs/>
+          <w:sz w:val="20"/>
+          <w:szCs w:val="20"/>
+          <w:lang w:eastAsia="es-EC"/>
+        </w:rPr>
+      </w:pPr>
+    </w:p>
     <w:sectPr>
-      <w:headerReference w:type="first" r:id="rId32"/>
+      <w:headerReference w:type="first" r:id="rId34"/>
       <w:pgSz w:w="11906" w:h="16838"/>
       <w:pgMar w:top="1417" w:right="1701" w:bottom="1417" w:left="1701" w:header="708" w:footer="708" w:gutter="0"/>
       <w:pgNumType w:start="1"/>
@@ -6630,7 +7063,7 @@
         <v:path o:extrusionok="f" gradientshapeok="t" o:connecttype="rect"/>
         <o:lock v:ext="edit" aspectratio="t"/>
       </v:shapetype>
-      <v:shape id="_x0000_i1039" type="#_x0000_t75" style="width:10.65pt;height:10.65pt" o:bullet="t">
+      <v:shape id="_x0000_i1050" type="#_x0000_t75" style="width:10.5pt;height:10.5pt" o:bullet="t">
         <v:imagedata r:id="rId1" o:title="mso3E28"/>
       </v:shape>
     </w:pict>

</xml_diff>